<commit_message>
docs(lab2): add context ER diagram
</commit_message>
<xml_diff>
--- a/实验二_软件架构设计与微服务拆分/06_数据模型ER图与数据字典.docx
+++ b/实验二_软件架构设计与微服务拆分/06_数据模型ER图与数据字典.docx
@@ -605,7 +605,54 @@
           </w:tcPr>
           <w:p>
             <w:r>
-              <w:t>ER 分图按限界上下文组织：会员上下文（customer、member_profile、privacy_consent）；门店上下文（store、table_slot、business_hours）；预约上下文（reservation、waitlist、capacity_lock）；订单支付上下文（order、order_item、payment、refund）；猫咪档案上下文（cat_profile、health_check_in）；运营分析上下文（campaign、coupon、metric_snapshot、audit_log）。实体总数 18 个，满足 ≥15 个实体要求。多租户策略采用 store_id 行级隔离 + 总部跨门店授权；核心交易表按 store_id、reservation_date 分区。</w:t>
+              <w:t>ER 分图按限界上下文组织：会员上下文（customer、member_profile、privacy_consent）；门店上下文（store、table_slot、business_hours）；预约上下文（reservation、waitlist、capacity_lock）；订单支付上下文（order、order_item、payment、refund）；猫咪档案上下文（cat_profile、health_check_in）；运营分析上下文（campaign、coupon、metric_snapshot、audit_log）。实体总数 19 个，满足 ≥15 个实体要求。多租户策略采用 store_id 行级隔离 + 总部跨门店授权；核心交易表按 store_id、reservation_date 分区。</w:t>
+            </w:r>
+          </w:p>
+          <w:p>
+            <w:pPr>
+              <w:jc w:val="center"/>
+            </w:pPr>
+            <w:r>
+              <w:drawing>
+                <wp:inline xmlns:a="http://schemas.openxmlformats.org/drawingml/2006/main" xmlns:pic="http://schemas.openxmlformats.org/drawingml/2006/picture">
+                  <wp:extent cx="5349240" cy="3716314"/>
+                  <wp:docPr id="1" name="Picture 1"/>
+                  <wp:cNvGraphicFramePr>
+                    <a:graphicFrameLocks noChangeAspect="1"/>
+                  </wp:cNvGraphicFramePr>
+                  <a:graphic>
+                    <a:graphicData uri="http://schemas.openxmlformats.org/drawingml/2006/picture">
+                      <pic:pic>
+                        <pic:nvPicPr>
+                          <pic:cNvPr id="0" name="lab2_er_context_diagram.png"/>
+                          <pic:cNvPicPr/>
+                        </pic:nvPicPr>
+                        <pic:blipFill>
+                          <a:blip r:embed="rId13"/>
+                          <a:stretch>
+                            <a:fillRect/>
+                          </a:stretch>
+                        </pic:blipFill>
+                        <pic:spPr>
+                          <a:xfrm>
+                            <a:off x="0" y="0"/>
+                            <a:ext cx="5349240" cy="3716314"/>
+                          </a:xfrm>
+                          <a:prstGeom prst="rect"/>
+                        </pic:spPr>
+                      </pic:pic>
+                    </a:graphicData>
+                  </a:graphic>
+                </wp:inline>
+              </w:drawing>
+            </w:r>
+          </w:p>
+          <w:p>
+            <w:pPr>
+              <w:jc w:val="center"/>
+            </w:pPr>
+            <w:r>
+              <w:t>图2-5 数据模型 ER 图（按上下文分图）</w:t>
             </w:r>
           </w:p>
         </w:tc>

</xml_diff>